<commit_message>
updated address and email
</commit_message>
<xml_diff>
--- a/public/legal/Travionza-Legal-Policies-Complete.docx
+++ b/public/legal/Travionza-Legal-Policies-Complete.docx
@@ -3177,7 +3177,7 @@
           <w:sz w:val="21"/>
           <w:szCs w:val="21"/>
         </w:rPr>
-        <w:t xml:space="preserve">Address: [Business address, Utah, USA]</w:t>
+        <w:t>Address: 7533 S Center View Ct, Ste 210, West Jordan, UT 84084</w:t>
       </w:r>
     </w:p>
     <w:p>
@@ -4770,7 +4770,7 @@
           <w:sz w:val="21"/>
           <w:szCs w:val="21"/>
         </w:rPr>
-        <w:t xml:space="preserve">Address: [Business address, Utah, USA]</w:t>
+        <w:t>Address: 7533 S Center View Ct, Ste 210, West Jordan, UT 84084</w:t>
       </w:r>
     </w:p>
     <w:p>
@@ -7784,7 +7784,7 @@
           <w:sz w:val="21"/>
           <w:szCs w:val="21"/>
         </w:rPr>
-        <w:t xml:space="preserve">Address: [Business address, Utah, USA]</w:t>
+        <w:t>Address: 7533 S Center View Ct, Ste 210, West Jordan, UT 84084</w:t>
       </w:r>
     </w:p>
     <w:sectPr>

</xml_diff>